<commit_message>
Label internal consistency coefficients explicitly as Pearson
</commit_message>
<xml_diff>
--- a/outputs/internal_consistency.docx
+++ b/outputs/internal_consistency.docx
@@ -94,7 +94,7 @@
           <w:rtl w:val="1"/>
           <w:bCs w:val="1"/>
         </w:rPr>
-        <w:t>ملخص معاملات الارتباط المصححة ودلالتها في المحاور الستة</w:t>
+        <w:t>ملخص معاملات ارتباط بيرسون المصححة ودلالتها في المحاور الستة</w:t>
       </w:r>
     </w:p>
     <w:tbl>
@@ -1620,7 +1620,7 @@
           <w:rtl w:val="1"/>
           <w:bCs w:val="1"/>
         </w:rPr>
-        <w:t>معاملات الارتباط المصححة لبنود محور الوعي بالحوكمة الرقمية</w:t>
+        <w:t>معاملات ارتباط بيرسون المصححة لبنود محور الوعي بالحوكمة الرقمية</w:t>
       </w:r>
     </w:p>
     <w:tbl>
@@ -1742,7 +1742,9 @@
                 <w:rtl w:val="1"/>
                 <w:bCs w:val="1"/>
               </w:rPr>
-              <w:t>الارتباط المصحح r</w:t>
+              <w:t>معامل</w:t>
+              <w:br/>
+              <w:t>بيرسون r</w:t>
             </w:r>
           </w:p>
         </w:tc>
@@ -3087,7 +3089,7 @@
           <w:rtl w:val="1"/>
           <w:bCs w:val="1"/>
         </w:rPr>
-        <w:t>معاملات الارتباط المصححة لبنود محور توظيف الحوكمة الرقمية</w:t>
+        <w:t>معاملات ارتباط بيرسون المصححة لبنود محور توظيف الحوكمة الرقمية</w:t>
       </w:r>
     </w:p>
     <w:tbl>
@@ -3209,7 +3211,9 @@
                 <w:rtl w:val="1"/>
                 <w:bCs w:val="1"/>
               </w:rPr>
-              <w:t>الارتباط المصحح r</w:t>
+              <w:t>معامل</w:t>
+              <w:br/>
+              <w:t>بيرسون r</w:t>
             </w:r>
           </w:p>
         </w:tc>
@@ -4714,7 +4718,7 @@
           <w:rtl w:val="1"/>
           <w:bCs w:val="1"/>
         </w:rPr>
-        <w:t>معاملات الارتباط المصححة لبنود محور تشكيل الممارسة الاتصالية</w:t>
+        <w:t>معاملات ارتباط بيرسون المصححة لبنود محور تشكيل الممارسة الاتصالية</w:t>
       </w:r>
     </w:p>
     <w:tbl>
@@ -4836,7 +4840,9 @@
                 <w:rtl w:val="1"/>
                 <w:bCs w:val="1"/>
               </w:rPr>
-              <w:t>الارتباط المصحح r</w:t>
+              <w:t>معامل</w:t>
+              <w:br/>
+              <w:t>بيرسون r</w:t>
             </w:r>
           </w:p>
         </w:tc>
@@ -6021,7 +6027,7 @@
           <w:rtl w:val="1"/>
           <w:bCs w:val="1"/>
         </w:rPr>
-        <w:t>معاملات الارتباط المصححة لبنود محور المنفعة المدركة</w:t>
+        <w:t>معاملات ارتباط بيرسون المصححة لبنود محور المنفعة المدركة</w:t>
       </w:r>
     </w:p>
     <w:tbl>
@@ -6143,7 +6149,9 @@
                 <w:rtl w:val="1"/>
                 <w:bCs w:val="1"/>
               </w:rPr>
-              <w:t>الارتباط المصحح r</w:t>
+              <w:t>معامل</w:t>
+              <w:br/>
+              <w:t>بيرسون r</w:t>
             </w:r>
           </w:p>
         </w:tc>
@@ -7670,7 +7678,7 @@
           <w:rtl w:val="1"/>
           <w:bCs w:val="1"/>
         </w:rPr>
-        <w:t>معاملات الارتباط المصححة لبنود محور البعد المؤسسي للتنمية المستدامة</w:t>
+        <w:t>معاملات ارتباط بيرسون المصححة لبنود محور البعد المؤسسي للتنمية المستدامة</w:t>
       </w:r>
     </w:p>
     <w:tbl>
@@ -7792,7 +7800,9 @@
                 <w:rtl w:val="1"/>
                 <w:bCs w:val="1"/>
               </w:rPr>
-              <w:t>الارتباط المصحح r</w:t>
+              <w:t>معامل</w:t>
+              <w:br/>
+              <w:t>بيرسون r</w:t>
             </w:r>
           </w:p>
         </w:tc>
@@ -9637,7 +9647,7 @@
           <w:rtl w:val="1"/>
           <w:bCs w:val="1"/>
         </w:rPr>
-        <w:t>معاملات الارتباط المصححة لبنود محور شدة التحديات</w:t>
+        <w:t>معاملات ارتباط بيرسون المصححة لبنود محور شدة التحديات</w:t>
       </w:r>
     </w:p>
     <w:tbl>
@@ -9759,7 +9769,9 @@
                 <w:rtl w:val="1"/>
                 <w:bCs w:val="1"/>
               </w:rPr>
-              <w:t>الارتباط المصحح r</w:t>
+              <w:t>معامل</w:t>
+              <w:br/>
+              <w:t>بيرسون r</w:t>
             </w:r>
           </w:p>
         </w:tc>

</xml_diff>